<commit_message>
Sync the offline agreement sources with the live envelope: W-9 exhibit
Exhibit 1 (Substitute Form W-9) added to agent-agreement.md and the
generated Delt-Sales-Agent-Agreement.docx so the counsel-review draft
matches what the agent-esign envelope actually sends.

Co-Authored-By: Claude Fable 5 <noreply@anthropic.com>
Claude-Session: https://claude.ai/code/session_01HNUCir4TYRtsv8sGNx8tPK
</commit_message>
<xml_diff>
--- a/docs/hiring/Delt-Sales-Agent-Agreement.docx
+++ b/docs/hiring/Delt-Sales-Agent-Agreement.docx
@@ -3502,6 +3502,170 @@
           <w:sz w:val="26"/>
           <w:szCs w:val="26"/>
         </w:rPr>
+        <w:t xml:space="preserve">EXHIBIT 1 — SUBSTITUTE FORM W-9</w:t>
+      </w:r>
+    </w:p>
+    <w:p>
+      <w:pPr>
+        <w:spacing w:after="140"/>
+        <w:jc w:val="both"/>
+      </w:pPr>
+      <w:r>
+        <w:rPr>
+          <w:rFonts w:ascii="Georgia" w:cs="Georgia" w:eastAsia="Georgia" w:hAnsi="Georgia"/>
+          <w:i/>
+          <w:iCs/>
+          <w:sz w:val="22"/>
+          <w:szCs w:val="22"/>
+        </w:rPr>
+        <w:t xml:space="preserve">Request for Taxpayer Identification Number and Certification</w:t>
+      </w:r>
+    </w:p>
+    <w:p>
+      <w:pPr>
+        <w:spacing w:after="140"/>
+        <w:jc w:val="both"/>
+      </w:pPr>
+      <w:r>
+        <w:rPr>
+          <w:rFonts w:ascii="Georgia" w:cs="Georgia" w:eastAsia="Georgia" w:hAnsi="Georgia"/>
+          <w:sz w:val="22"/>
+          <w:szCs w:val="22"/>
+        </w:rPr>
+        <w:t xml:space="preserve">Agent is engaged as a 1099 independent contractor. Complete this substitute Form W-9 so Delt Pay LLC can report payments on Form 1099-NEC. Delt does not withhold taxes from contractor compensation. This information is used for tax reporting only.</w:t>
+      </w:r>
+    </w:p>
+    <w:p>
+      <w:pPr>
+        <w:spacing w:after="60" w:before="60"/>
+      </w:pPr>
+      <w:r>
+        <w:rPr>
+          <w:rFonts w:ascii="Georgia" w:cs="Georgia" w:eastAsia="Georgia" w:hAnsi="Georgia"/>
+          <w:sz w:val="22"/>
+          <w:szCs w:val="22"/>
+        </w:rPr>
+        <w:t xml:space="preserve">1. Name (as shown on your income tax return): _________________________________________________</w:t>
+      </w:r>
+    </w:p>
+    <w:p>
+      <w:pPr>
+        <w:spacing w:after="60" w:before="60"/>
+      </w:pPr>
+      <w:r>
+        <w:rPr>
+          <w:rFonts w:ascii="Georgia" w:cs="Georgia" w:eastAsia="Georgia" w:hAnsi="Georgia"/>
+          <w:sz w:val="22"/>
+          <w:szCs w:val="22"/>
+        </w:rPr>
+        <w:t xml:space="preserve">2. Business name / disregarded entity name, if different: _______________________________________</w:t>
+      </w:r>
+    </w:p>
+    <w:p>
+      <w:pPr>
+        <w:spacing w:after="60" w:before="60"/>
+      </w:pPr>
+      <w:r>
+        <w:rPr>
+          <w:rFonts w:ascii="Georgia" w:cs="Georgia" w:eastAsia="Georgia" w:hAnsi="Georgia"/>
+          <w:sz w:val="22"/>
+          <w:szCs w:val="22"/>
+        </w:rPr>
+        <w:t xml:space="preserve">3. Federal tax classification (Individual/sole proprietor, C corp, S corp, Partnership, LLC): ____________________</w:t>
+      </w:r>
+    </w:p>
+    <w:p>
+      <w:pPr>
+        <w:spacing w:after="60" w:before="60"/>
+      </w:pPr>
+      <w:r>
+        <w:rPr>
+          <w:rFonts w:ascii="Georgia" w:cs="Georgia" w:eastAsia="Georgia" w:hAnsi="Georgia"/>
+          <w:sz w:val="22"/>
+          <w:szCs w:val="22"/>
+        </w:rPr>
+        <w:t xml:space="preserve">4. Address (number, street, city, state, ZIP): __________________________________________________</w:t>
+      </w:r>
+    </w:p>
+    <w:p>
+      <w:pPr>
+        <w:spacing w:after="60" w:before="60"/>
+      </w:pPr>
+      <w:r>
+        <w:rPr>
+          <w:rFonts w:ascii="Georgia" w:cs="Georgia" w:eastAsia="Georgia" w:hAnsi="Georgia"/>
+          <w:sz w:val="22"/>
+          <w:szCs w:val="22"/>
+        </w:rPr>
+        <w:t xml:space="preserve">5. Taxpayer Identification Number (SSN or EIN): _________________________________</w:t>
+      </w:r>
+    </w:p>
+    <w:p>
+      <w:pPr>
+        <w:spacing w:after="120"/>
+      </w:pPr>
+    </w:p>
+    <w:p>
+      <w:pPr>
+        <w:pStyle w:val="Heading2"/>
+        <w:spacing w:after="120" w:before="280"/>
+      </w:pPr>
+      <w:r>
+        <w:rPr>
+          <w:rFonts w:ascii="Georgia" w:cs="Georgia" w:eastAsia="Georgia" w:hAnsi="Georgia"/>
+          <w:b/>
+          <w:bCs/>
+          <w:color w:val="111827"/>
+          <w:sz w:val="24"/>
+          <w:szCs w:val="24"/>
+        </w:rPr>
+        <w:t xml:space="preserve">Certification</w:t>
+      </w:r>
+    </w:p>
+    <w:p>
+      <w:pPr>
+        <w:spacing w:after="140"/>
+        <w:jc w:val="both"/>
+      </w:pPr>
+      <w:r>
+        <w:rPr>
+          <w:rFonts w:ascii="Georgia" w:cs="Georgia" w:eastAsia="Georgia" w:hAnsi="Georgia"/>
+          <w:sz w:val="22"/>
+          <w:szCs w:val="22"/>
+        </w:rPr>
+        <w:t xml:space="preserve">Under penalties of perjury, I certify that: (1) the number shown on this form is my correct taxpayer identification number (or I am waiting for a number to be issued to me); (2) I am not subject to backup withholding because (a) I am exempt from backup withholding, or (b) I have not been notified by the Internal Revenue Service (IRS) that I am subject to backup withholding as a result of a failure to report all interest or dividends, or (c) the IRS has notified me that I am no longer subject to backup withholding; (3) I am a U.S. citizen or other U.S. person; and (4) the FATCA code(s) entered on this form (if any) indicating that I am exempt from FATCA reporting is correct.</w:t>
+      </w:r>
+    </w:p>
+    <w:p>
+      <w:pPr>
+        <w:spacing w:after="60" w:before="60"/>
+      </w:pPr>
+      <w:r>
+        <w:rPr>
+          <w:rFonts w:ascii="Georgia" w:cs="Georgia" w:eastAsia="Georgia" w:hAnsi="Georgia"/>
+          <w:sz w:val="22"/>
+          <w:szCs w:val="22"/>
+        </w:rPr>
+        <w:t xml:space="preserve">Signature of U.S. person: ________________________________   Date: ____________</w:t>
+      </w:r>
+    </w:p>
+    <w:p>
+      <w:pPr>
+        <w:pageBreakBefore/>
+      </w:pPr>
+    </w:p>
+    <w:p>
+      <w:pPr>
+        <w:spacing w:after="120"/>
+      </w:pPr>
+      <w:r>
+        <w:rPr>
+          <w:rFonts w:ascii="Georgia" w:cs="Georgia" w:eastAsia="Georgia" w:hAnsi="Georgia"/>
+          <w:b/>
+          <w:bCs/>
+          <w:sz w:val="26"/>
+          <w:szCs w:val="26"/>
+        </w:rPr>
         <w:t xml:space="preserve">SIGNATURE PAGE — AGREEMENT AND SCHEDULES A &amp; B</w:t>
       </w:r>
     </w:p>
@@ -3516,7 +3680,7 @@
           <w:sz w:val="22"/>
           <w:szCs w:val="22"/>
         </w:rPr>
-        <w:t xml:space="preserve">One signature below executes this Agreement together with Schedule A (Fee Schedule &amp; Net Program Revenue) and Schedule B (Compensation Plan).</w:t>
+        <w:t xml:space="preserve">One signature below executes this Agreement together with Schedule A (Fee Schedule &amp; Net Program Revenue), Schedule B (Compensation Plan), and Exhibit 1 (Substitute Form W-9).</w:t>
       </w:r>
     </w:p>
     <w:p>

</xml_diff>